<commit_message>
fix(pós-revisão do pacote): PDF da contribuição regenerado com as refs corrigidas; Abstract EN em arquivo próprio (a ABC traduz); CHEERS 10/22 corrigidos; carta com hedge; EN idiomático
Co-Authored-By: Claude Fable 5 <noreply@anthropic.com>
</commit_message>
<xml_diff>
--- a/submissao-abc/manuscrito-cego.docx
+++ b/submissao-abc/manuscrito-cego.docx
@@ -2,7 +2,7 @@
 <file path=word/document.xml><?xml version="1.0" encoding="utf-8"?>
 <w:document xmlns:w="http://schemas.openxmlformats.org/wordprocessingml/2006/main" xmlns:m="http://schemas.openxmlformats.org/officeDocument/2006/math" xmlns:r="http://schemas.openxmlformats.org/officeDocument/2006/relationships" xmlns:o="urn:schemas-microsoft-com:office:office" xmlns:v="urn:schemas-microsoft-com:vml" xmlns:w10="urn:schemas-microsoft-com:office:word" xmlns:a="http://schemas.openxmlformats.org/drawingml/2006/main" xmlns:pic="http://schemas.openxmlformats.org/drawingml/2006/picture" xmlns:wp="http://schemas.openxmlformats.org/drawingml/2006/wordprocessingDrawing">
   <w:body>
-    <w:bookmarkStart w:id="28" w:name="X28a0e69760d5885bcc65313418870cce0814cda"/>
+    <w:bookmarkStart w:id="27" w:name="X28a0e69760d5885bcc65313418870cce0814cda"/>
     <w:p>
       <w:pPr>
         <w:pStyle w:val="Heading1"/>
@@ -35,7 +35,7 @@
         <w:t xml:space="preserve"> </w:t>
       </w:r>
       <w:r>
-        <w:t xml:space="preserve">A Conitec recomendou preliminarmente contra a angiotomografia coronariana (angioTC) como primeira linha na doença coronariana estável de probabilidade pré-teste baixa ou intermediária, por incertezas de capacidade e orçamento. Falta perguntar</w:t>
+        <w:t xml:space="preserve">A Conitec recomendou preliminarmente contra a angiotomografia coronariana (angioTC) como primeira linha na suspeita de doença coronariana estável com probabilidade pré-teste baixa ou intermediária, por incertezas de capacidade e orçamento. Falta perguntar</w:t>
       </w:r>
       <w:r>
         <w:t xml:space="preserve"> </w:t>
@@ -134,150 +134,6 @@
       </w:r>
       <w:r>
         <w:t xml:space="preserve">A sustentabilidade orçamentária depende da posição no percurso e do exame substituído, não do preço: parâmetros que os registros não identificam e o protocolo define. A evidência econômica não sustenta decisão uniforme para a faixa baixa/intermediária; sustenta condicionar a incorporação ao posicionamento e ao exame substituído, como estratifica a Diretriz SBC de Síndrome Coronariana Crônica 2025, e avaliar o filtro em separado.</w:t>
-      </w:r>
-    </w:p>
-    <w:bookmarkEnd w:id="9"/>
-    <w:bookmarkStart w:id="10" w:name="abstract"/>
-    <w:p>
-      <w:pPr>
-        <w:pStyle w:val="Heading2"/>
-      </w:pPr>
-      <w:r>
-        <w:t xml:space="preserve">Abstract</w:t>
-      </w:r>
-    </w:p>
-    <w:p>
-      <w:pPr>
-        <w:pStyle w:val="FirstParagraph"/>
-      </w:pPr>
-      <w:r>
-        <w:rPr>
-          <w:b/>
-          <w:bCs/>
-        </w:rPr>
-        <w:t xml:space="preserve">Background:</w:t>
-      </w:r>
-      <w:r>
-        <w:t xml:space="preserve"> </w:t>
-      </w:r>
-      <w:r>
-        <w:t xml:space="preserve">Brazil’s Conitec preliminarily recommended against coronary computed tomography angiography (CCTA) as a first-line test for low-or-intermediate-probability stable chest pain, citing capacity and budget uncertainties. The missing question is</w:t>
-      </w:r>
-      <w:r>
-        <w:t xml:space="preserve"> </w:t>
-      </w:r>
-      <w:r>
-        <w:rPr>
-          <w:i/>
-          <w:iCs/>
-        </w:rPr>
-        <w:t xml:space="preserve">where</w:t>
-      </w:r>
-      <w:r>
-        <w:t xml:space="preserve">, not only</w:t>
-      </w:r>
-      <w:r>
-        <w:t xml:space="preserve"> </w:t>
-      </w:r>
-      <w:r>
-        <w:rPr>
-          <w:i/>
-          <w:iCs/>
-        </w:rPr>
-        <w:t xml:space="preserve">whether</w:t>
-      </w:r>
-      <w:r>
-        <w:t xml:space="preserve">.</w:t>
-      </w:r>
-    </w:p>
-    <w:p>
-      <w:pPr>
-        <w:pStyle w:val="BodyText"/>
-      </w:pPr>
-      <w:r>
-        <w:rPr>
-          <w:b/>
-          <w:bCs/>
-        </w:rPr>
-        <w:t xml:space="preserve">Objectives:</w:t>
-      </w:r>
-      <w:r>
-        <w:t xml:space="preserve"> </w:t>
-      </w:r>
-      <w:r>
-        <w:t xml:space="preserve">To characterize the CCTA-compatible scanner capacity of the Unified Health System (SUS) and the pathway positions in which CCTA is budget-sustainable.</w:t>
-      </w:r>
-    </w:p>
-    <w:p>
-      <w:pPr>
-        <w:pStyle w:val="BodyText"/>
-      </w:pPr>
-      <w:r>
-        <w:rPr>
-          <w:b/>
-          <w:bCs/>
-        </w:rPr>
-        <w:t xml:space="preserve">Methods:</w:t>
-      </w:r>
-      <w:r>
-        <w:t xml:space="preserve"> </w:t>
-      </w:r>
-      <w:r>
-        <w:t xml:space="preserve">Nationwide analysis of public databases: capacity by detector rows after regulation SAES/MS 3,695/2026, and a threshold analysis (catheterization change required for neutrality) in two PICOs (first line; pre-catheterization gatekeeping), with differences from ten randomized trials and one meta-analysis, with and without revascularization.</w:t>
-      </w:r>
-    </w:p>
-    <w:p>
-      <w:pPr>
-        <w:pStyle w:val="BodyText"/>
-      </w:pPr>
-      <w:r>
-        <w:rPr>
-          <w:b/>
-          <w:bCs/>
-        </w:rPr>
-        <w:t xml:space="preserve">Results:</w:t>
-      </w:r>
-      <w:r>
-        <w:t xml:space="preserve"> </w:t>
-      </w:r>
-      <w:r>
-        <w:t xml:space="preserve">In the aggregate first-line PICO, the evaluated prices exceed neutrality: the displaced test in the SUS is mostly exercise ECG (76% of 787,954 episodes/year; R$ 32) and the best observed difference (+4.1/100) does not cover R$ 550; in the intermediate stratum, only substituting perfusion scintigraphy brings R$ 550 into the uncertainty zone (R$ 458–560 with revascularization). In gatekeeping the sign reverses: differences of 66–86/100 and neutrality at R$ 482–625 (R$ 841–868 with revascularization). Of 315 facilities with ≥64-row scanners (432, a floor), 79 combine catheterization laboratories and coronary output; twelve states have none.</w:t>
-      </w:r>
-    </w:p>
-    <w:p>
-      <w:pPr>
-        <w:pStyle w:val="BodyText"/>
-      </w:pPr>
-      <w:r>
-        <w:rPr>
-          <w:b/>
-          <w:bCs/>
-        </w:rPr>
-        <w:t xml:space="preserve">Conclusions:</w:t>
-      </w:r>
-      <w:r>
-        <w:t xml:space="preserve"> </w:t>
-      </w:r>
-      <w:r>
-        <w:t xml:space="preserve">Budget sustainability is a property of pathway position and displaced test, not of price: parameters records do not identify and a protocol defines. The economic evidence does not support a uniform decision for the low-or-intermediate range; it supports conditioning incorporation on positioning and displaced test, as the 2025 SBC Chronic Coronary Syndrome Guideline stratifies, and assessing gatekeeping separately.</w:t>
-      </w:r>
-    </w:p>
-    <w:p>
-      <w:pPr>
-        <w:pStyle w:val="BodyText"/>
-      </w:pPr>
-      <w:r>
-        <w:rPr>
-          <w:b/>
-          <w:bCs/>
-        </w:rPr>
-        <w:t xml:space="preserve">Keywords:</w:t>
-      </w:r>
-      <w:r>
-        <w:t xml:space="preserve"> </w:t>
-      </w:r>
-      <w:r>
-        <w:t xml:space="preserve">Computed Tomography Angiography; Coronary Artery Disease; Technology Assessment, Biomedical; Costs and Cost Analysis; Unified Health System.</w:t>
       </w:r>
     </w:p>
     <w:p>
@@ -287,8 +143,8 @@
         </w:pict>
       </w:r>
     </w:p>
-    <w:bookmarkEnd w:id="10"/>
-    <w:bookmarkStart w:id="11" w:name="introdução"/>
+    <w:bookmarkEnd w:id="9"/>
+    <w:bookmarkStart w:id="10" w:name="introdução"/>
     <w:p>
       <w:pPr>
         <w:pStyle w:val="Heading2"/>
@@ -473,8 +329,8 @@
         <w:t xml:space="preserve">o desmembrou por número de canais. Este estudo usa esse novo cadastro para caracterizar a capacidade compatível com angioTC e uma análise de limiar para determinar, por posição no percurso e por estrato de probabilidade pré-teste, a que preço a tecnologia é orçamentariamente neutra, com dados públicos e método reproduzível.</w:t>
       </w:r>
     </w:p>
-    <w:bookmarkEnd w:id="11"/>
-    <w:bookmarkStart w:id="12" w:name="métodos"/>
+    <w:bookmarkEnd w:id="10"/>
+    <w:bookmarkStart w:id="11" w:name="métodos"/>
     <w:p>
       <w:pPr>
         <w:pStyle w:val="Heading2"/>
@@ -648,8 +504,8 @@
         <w:t xml:space="preserve">Um único script regenera todas as tabelas a partir dos microdados versionados e recusa cobertura parcial. Código e dados estão em repositório público [URL/DOI].</w:t>
       </w:r>
     </w:p>
-    <w:bookmarkEnd w:id="12"/>
-    <w:bookmarkStart w:id="17" w:name="resultados"/>
+    <w:bookmarkEnd w:id="11"/>
+    <w:bookmarkStart w:id="16" w:name="resultados"/>
     <w:p>
       <w:pPr>
         <w:pStyle w:val="Heading2"/>
@@ -658,7 +514,7 @@
         <w:t xml:space="preserve">Resultados</w:t>
       </w:r>
     </w:p>
-    <w:bookmarkStart w:id="13" w:name="capacidade-instalada"/>
+    <w:bookmarkStart w:id="12" w:name="capacidade-instalada"/>
     <w:p>
       <w:pPr>
         <w:pStyle w:val="Heading3"/>
@@ -999,26 +855,26 @@
         <w:t xml:space="preserve">A capacidade compatível é escassa e desigual. A densidade nacional é de 2,02 equipamentos ≥64 canais por milhão de habitantes; Amapá, Piauí e Tocantins não têm nenhum, e doze UFs não têm nenhum estabelecimento no estrato pronto. A desigualdade é mais acentuada sobre o hardware compatível do que sobre o parque total (coeficiente de variação 0,86 contra 0,32; Gini 0,30 contra 0,14), de modo que projeções ancoradas no total de tomógrafos superestimam a capacidade de fato acessível (Figura 1).</w:t>
       </w:r>
     </w:p>
+    <w:bookmarkEnd w:id="12"/>
+    <w:bookmarkStart w:id="13" w:name="cenário-atual"/>
+    <w:p>
+      <w:pPr>
+        <w:pStyle w:val="Heading3"/>
+      </w:pPr>
+      <w:r>
+        <w:t xml:space="preserve">Cenário atual</w:t>
+      </w:r>
+    </w:p>
+    <w:p>
+      <w:pPr>
+        <w:pStyle w:val="FirstParagraph"/>
+      </w:pPr>
+      <w:r>
+        <w:t xml:space="preserve">Em 2025 o SUS realizou 787.954 episódios de investigação funcional, a R$ 146,1 milhões (R$ 185,46 por episódio). O volume e o gasto moram em exames diferentes: o teste ergométrico responde por 76% dos episódios mas só 13% do gasto (R$ 32 cada), enquanto a cintilografia de perfusão responde por 19% dos episódios e 82% do gasto (R$ 787 cada). A ecocardiografia de estresse somou 33.766 episódios (R$ 196 cada) e as OCI de síndrome coronariana crônica, apenas 0,96% do total. Houve 163.803 cateterismos (R$ 730,14), 133.934 angioplastias (R$ 7.713) e 23.290 revascularizações cirúrgicas (R$ 25.904). Não existe código para a angioTC, e o de contraste para tomografia tem faturamento zero: a produção que exista é administrativamente invisível.</w:t>
+      </w:r>
+    </w:p>
     <w:bookmarkEnd w:id="13"/>
-    <w:bookmarkStart w:id="14" w:name="cenário-atual"/>
-    <w:p>
-      <w:pPr>
-        <w:pStyle w:val="Heading3"/>
-      </w:pPr>
-      <w:r>
-        <w:t xml:space="preserve">Cenário atual</w:t>
-      </w:r>
-    </w:p>
-    <w:p>
-      <w:pPr>
-        <w:pStyle w:val="FirstParagraph"/>
-      </w:pPr>
-      <w:r>
-        <w:t xml:space="preserve">Em 2025 o SUS realizou 787.954 episódios de investigação funcional, a R$ 146,1 milhões (R$ 185,46 por episódio). O volume e o gasto moram em exames diferentes: o teste ergométrico responde por 76% dos episódios mas só 13% do gasto (R$ 32 cada), enquanto a cintilografia de perfusão responde por 19% dos episódios e 82% do gasto (R$ 787 cada). A ecocardiografia de estresse somou 33.766 episódios (R$ 196 cada) e as OCI de síndrome coronariana crônica, apenas 0,96% do total. Houve 163.803 cateterismos (R$ 730,14), 133.934 angioplastias (R$ 7.713) e 23.290 revascularizações cirúrgicas (R$ 25.904). Não existe código para a angioTC, e o de contraste para tomografia tem faturamento zero: a produção que exista é administrativamente invisível.</w:t>
-      </w:r>
-    </w:p>
-    <w:bookmarkEnd w:id="14"/>
-    <w:bookmarkStart w:id="15" w:name="análise-de-limiar"/>
+    <w:bookmarkStart w:id="14" w:name="análise-de-limiar"/>
     <w:p>
       <w:pPr>
         <w:pStyle w:val="Heading3"/>
@@ -1566,14 +1422,54 @@
         <w:t xml:space="preserve">Notas: Δ de cateterismo de primeira linha de −6,3 a +4,1 por 100. A coluna com revascularização pareia cada Δ de cateterismo com a revascularização do mesmo estudo (PRECISE, +4,0/100, −R$ 359; Foy, 13 ensaios, +2,7/100, −R$ 208), por isso varre faixa mais estreita que a coluna sem revascularização; esse envelope superestima o débito na baixa; SCOT-HEART (+1,5 e +0,6/100) no aditivo; DISCHARGE (−3,8/100; +R$ 293) e CONSERVE (−5,0/100; +R$ 386) no filtro. Com C_CATE = R$ 772,80, o filtro vai a R$ 510–662. Cenários adicionais (diferimento na baixa; percurso misto adotado pelo NATS, núcleo de avaliação de tecnologias do relatório preliminar, por episódio; descritivo sem protocolo, ergometria seguida de imagem em fração p ≤ 0,31) na Tabela S8.</w:t>
       </w:r>
     </w:p>
+    <w:bookmarkEnd w:id="14"/>
+    <w:bookmarkStart w:id="15" w:name="Xa81756b591421ff53b300d52afe744c9786a2be"/>
+    <w:p>
+      <w:pPr>
+        <w:pStyle w:val="Heading3"/>
+      </w:pPr>
+      <w:r>
+        <w:t xml:space="preserve">Eficiência diagnóstica e ordem de grandeza anual</w:t>
+      </w:r>
+    </w:p>
+    <w:p>
+      <w:pPr>
+        <w:pStyle w:val="FirstParagraph"/>
+      </w:pPr>
+      <w:r>
+        <w:t xml:space="preserve">Num segundo desfecho, apresentado como eficiência diagnóstica e mantido fora do cálculo econômico, a angioTC evita cateterismos sem doença obstrutiva em ambos os PICOs: de 0,9 a 5,9 por 100 contra estratégias funcionais (OR 0,77, IC95% 0,64–0,94, nos estudos de alta certeza) e de 53,7 a 81,0 por 100 contra cateterismo direto.</w:t>
+      </w:r>
+      <w:r>
+        <w:rPr>
+          <w:vertAlign w:val="superscript"/>
+        </w:rPr>
+        <w:t xml:space="preserve">26</w:t>
+      </w:r>
+      <w:r>
+        <w:t xml:space="preserve"> </w:t>
+      </w:r>
+      <w:r>
+        <w:t xml:space="preserve">A direção favorece a angioTC consistentemente, o que sustenta o ganho de adequação da indicação como o benefício mais robusto no horizonte de curto prazo (Tabela S6). Em ordem de grandeza anual, a R$ 550 e sobre o volume substituível, a adoção aditiva somaria +R$ 440 milhões; a substituição da cintilografia, −R$ 35 a +R$ 6 milhões; o filtro, +R$ 11 a −R$ 48 milhões. São cotas, não impacto orçamentário: a população elegível é fração não identificável dos denominadores (Tabela S7; Figura S1).</w:t>
+      </w:r>
+    </w:p>
     <w:bookmarkEnd w:id="15"/>
-    <w:bookmarkStart w:id="16" w:name="Xa81756b591421ff53b300d52afe744c9786a2be"/>
+    <w:bookmarkEnd w:id="16"/>
+    <w:bookmarkStart w:id="23" w:name="discussão"/>
+    <w:p>
+      <w:pPr>
+        <w:pStyle w:val="Heading2"/>
+      </w:pPr>
+      <w:r>
+        <w:t xml:space="preserve">Discussão</w:t>
+      </w:r>
+    </w:p>
+    <w:bookmarkStart w:id="17" w:name="achado-principal"/>
     <w:p>
       <w:pPr>
         <w:pStyle w:val="Heading3"/>
       </w:pPr>
       <w:r>
-        <w:t xml:space="preserve">Eficiência diagnóstica e ordem de grandeza anual</w:t>
+        <w:t xml:space="preserve">Achado principal</w:t>
       </w:r>
     </w:p>
     <w:p>
@@ -1581,39 +1477,66 @@
         <w:pStyle w:val="FirstParagraph"/>
       </w:pPr>
       <w:r>
-        <w:t xml:space="preserve">Num segundo desfecho, apresentado como eficiência diagnóstica e mantido fora do cálculo econômico, a angioTC evita cateterismos sem doença obstrutiva em ambos os PICOs: de 0,9 a 5,9 por 100 contra estratégias funcionais (OR 0,77, IC95% 0,64–0,94, nos estudos de alta certeza) e de 53,7 a 81,0 por 100 contra cateterismo direto.</w:t>
+        <w:t xml:space="preserve">Uma mesma tecnologia, ao mesmo preço, é orçamentariamente expansiva ou fica na zona de incerteza conforme três parâmetros: onde entra no percurso, o que substitui e quanta revascularização induz. Nenhum é identificável nos registros brasileiros; mas o que os registros não dizem, as diretrizes dizem, e declarar o comparador realista de cada faixa como premissa converte a limitação em resultado.</w:t>
+      </w:r>
+    </w:p>
+    <w:p>
+      <w:pPr>
+        <w:pStyle w:val="BodyText"/>
+      </w:pPr>
+      <w:r>
+        <w:t xml:space="preserve">Na probabilidade baixa, as diretrizes recomendam diferir ou usar escore de cálcio, enquanto o SUS faz uma ergometria de R$ 32: a angioTC não substitui nada de valor e é expansiva a qualquer preço plausível. Na intermediária, a ecocardiografia a R$ 196 não financia a troca; a cintilografia a R$ 787 financia, até que a revascularização adicional traga o preço de neutralidade de volta a R$ 458–560, cercando os R$ 550 propostos. Só no filtro antes de uma cinecoronariografia já indicada a angioTC cruza o limiar com folga.</w:t>
+      </w:r>
+    </w:p>
+    <w:p>
+      <w:pPr>
+        <w:pStyle w:val="BodyText"/>
+      </w:pPr>
+      <w:r>
+        <w:t xml:space="preserve">O cenário aditivo, a angioTC somada ao percurso sem substituir nada, é o mais desfavorável e, a nosso juízo, o mais provável se a incorporação criar o código sem protocolo. No SUS, a ergometria costuma preceder o encaminhamento ao cardiologista, e a própria Diretriz SBC de SCC 2025 sugere,</w:t>
+      </w:r>
+      <w:r>
+        <w:t xml:space="preserve"> </w:t>
+      </w:r>
+      <w:r>
+        <w:t xml:space="preserve">“se [capacidade funcional] preservada, iniciar com TE ou ecocardiograma de estresse”</w:t>
+      </w:r>
+      <w:r>
+        <w:t xml:space="preserve">;</w:t>
       </w:r>
       <w:r>
         <w:rPr>
           <w:vertAlign w:val="superscript"/>
         </w:rPr>
-        <w:t xml:space="preserve">26</w:t>
-      </w:r>
-      <w:r>
-        <w:t xml:space="preserve"> </w:t>
-      </w:r>
-      <w:r>
-        <w:t xml:space="preserve">A direção favorece a angioTC consistentemente, o que sustenta o ganho de adequação da indicação como o benefício mais robusto no horizonte de curto prazo (Tabela S6). Em ordem de grandeza anual, a R$ 550 e sobre o volume substituível, a adoção aditiva somaria +R$ 440 milhões; a substituição da cintilografia, −R$ 35 a +R$ 6 milhões; o filtro, +R$ 11 a −R$ 48 milhões. São cotas, não impacto orçamentário: a população elegível é fração não identificável dos denominadores (Tabela S7; Figura S1).</w:t>
-      </w:r>
-    </w:p>
-    <w:bookmarkEnd w:id="16"/>
+        <w:t xml:space="preserve">9</w:t>
+      </w:r>
+      <w:r>
+        <w:t xml:space="preserve"> </w:t>
+      </w:r>
+      <w:r>
+        <w:t xml:space="preserve">uma angioTC solicitada na especialidade chega depois dela, não em seu lugar. É juízo sobre implementação, não medida. Assim,</w:t>
+      </w:r>
+      <w:r>
+        <w:t xml:space="preserve"> </w:t>
+      </w:r>
+      <w:r>
+        <w:t xml:space="preserve">“primeira linha”</w:t>
+      </w:r>
+      <w:r>
+        <w:t xml:space="preserve"> </w:t>
+      </w:r>
+      <w:r>
+        <w:t xml:space="preserve">no SUS como ele é significa substituir a ergometria, e isso não fecha a nenhum preço plausível. A angioTC paga quando entra depois da ergometria: no lugar do encaminhamento à cintilografia (intermediária com protocolo) ou da cinecoronariografia eletiva já indicada (filtro). Capacidade e posicionamento apontam para o mesmo lugar: os 79 estabelecimentos prontos são hospitais com hemodinâmica, exatamente onde o paciente referenciado ao cateterismo já está.</w:t>
+      </w:r>
+    </w:p>
     <w:bookmarkEnd w:id="17"/>
-    <w:bookmarkStart w:id="24" w:name="discussão"/>
-    <w:p>
-      <w:pPr>
-        <w:pStyle w:val="Heading2"/>
-      </w:pPr>
-      <w:r>
-        <w:t xml:space="preserve">Discussão</w:t>
-      </w:r>
-    </w:p>
-    <w:bookmarkStart w:id="18" w:name="achado-principal"/>
+    <w:bookmarkStart w:id="18" w:name="o-que-dizem-as-diretrizes"/>
     <w:p>
       <w:pPr>
         <w:pStyle w:val="Heading3"/>
       </w:pPr>
       <w:r>
-        <w:t xml:space="preserve">Achado principal</w:t>
+        <w:t xml:space="preserve">O que dizem as diretrizes</w:t>
       </w:r>
     </w:p>
     <w:p>
@@ -1621,7 +1544,184 @@
         <w:pStyle w:val="FirstParagraph"/>
       </w:pPr>
       <w:r>
-        <w:t xml:space="preserve">Uma mesma tecnologia, ao mesmo preço, é orçamentariamente expansiva ou fica na zona de incerteza conforme três parâmetros: onde entra no percurso, o que substitui e quanta revascularização induz. Nenhum é identificável nos registros brasileiros; mas o que os registros não dizem, as diretrizes dizem, e declarar o comparador realista de cada faixa como premissa converte a limitação em resultado.</w:t>
+        <w:t xml:space="preserve">Das cinco diretrizes vigentes, apenas o NICE</w:t>
+      </w:r>
+      <w:r>
+        <w:rPr>
+          <w:vertAlign w:val="superscript"/>
+        </w:rPr>
+        <w:t xml:space="preserve">5</w:t>
+      </w:r>
+      <w:r>
+        <w:t xml:space="preserve"> </w:t>
+      </w:r>
+      <w:r>
+        <w:t xml:space="preserve">posiciona a angioTC como primeira linha uniforme na faixa</w:t>
+      </w:r>
+      <w:r>
+        <w:t xml:space="preserve"> </w:t>
+      </w:r>
+      <w:r>
+        <w:t xml:space="preserve">“baixa ou intermediária”</w:t>
+      </w:r>
+      <w:r>
+        <w:t xml:space="preserve">; as demais estratificam (Tabela S5). A ESC 2024</w:t>
+      </w:r>
+      <w:r>
+        <w:rPr>
+          <w:vertAlign w:val="superscript"/>
+        </w:rPr>
+        <w:t xml:space="preserve">7</w:t>
+      </w:r>
+      <w:r>
+        <w:t xml:space="preserve"> </w:t>
+      </w:r>
+      <w:r>
+        <w:t xml:space="preserve">a considera preferida só na probabilidade de 5–50% e recomenda imagem funcional a partir de 15%. A AHA/ACC 2021</w:t>
+      </w:r>
+      <w:r>
+        <w:rPr>
+          <w:vertAlign w:val="superscript"/>
+        </w:rPr>
+        <w:t xml:space="preserve">6</w:t>
+      </w:r>
+      <w:r>
+        <w:t xml:space="preserve"> </w:t>
+      </w:r>
+      <w:r>
+        <w:t xml:space="preserve">trata angioTC e imagem de estresse como co-iguais no risco intermediário-alto e, no baixo, recomenda escore de cálcio ou ergometria. O pedido submetido reproduz a formulação da Diretriz SBC/CBR de TC/RM 2024,</w:t>
+      </w:r>
+      <w:r>
+        <w:rPr>
+          <w:vertAlign w:val="superscript"/>
+        </w:rPr>
+        <w:t xml:space="preserve">8</w:t>
+      </w:r>
+      <w:r>
+        <w:t xml:space="preserve"> </w:t>
+      </w:r>
+      <w:r>
+        <w:t xml:space="preserve">que não distingue as faixas; mas a Diretriz SBC de Síndrome Coronariana Crônica 2025,</w:t>
+      </w:r>
+      <w:r>
+        <w:rPr>
+          <w:vertAlign w:val="superscript"/>
+        </w:rPr>
+        <w:t xml:space="preserve">9</w:t>
+      </w:r>
+      <w:r>
+        <w:t xml:space="preserve"> </w:t>
+      </w:r>
+      <w:r>
+        <w:t xml:space="preserve">posterior e específica, separa a baixa (IIb-B) da intermediária (I-A) e condiciona a escolha do exame inicial ao serviço e ao paciente: capacidade funcional, ECG basal, acesso local e função renal. A diretriz não diz qual exame a angioTC substitui; diz que depende, que é a tese deste artigo. O filtro antes de cinecoronariografia já indicada é endossado, em graus diferentes, por quatro das cinco diretrizes, e é a indicação com maior espaço econômico, embora não seja a que foi requerida.</w:t>
+      </w:r>
+    </w:p>
+    <w:bookmarkEnd w:id="18"/>
+    <w:bookmarkStart w:id="19" w:name="capacidade"/>
+    <w:p>
+      <w:pPr>
+        <w:pStyle w:val="Heading3"/>
+      </w:pPr>
+      <w:r>
+        <w:t xml:space="preserve">Capacidade</w:t>
+      </w:r>
+    </w:p>
+    <w:p>
+      <w:pPr>
+        <w:pStyle w:val="FirstParagraph"/>
+      </w:pPr>
+      <w:r>
+        <w:t xml:space="preserve">O CNES agora permite contar tomógrafos por canais, mas 74,6% dos estabelecimentos ainda não migraram: os 432 são piso. Dos 432, 293 são de 64 canais, faixa em que equipamentos de gerações antigas entregam dose muito maior em aquisição retrospectiva; o CNES não registra geração nem ano, mais um motivo para tratar</w:t>
+      </w:r>
+      <w:r>
+        <w:t xml:space="preserve"> </w:t>
+      </w:r>
+      <w:r>
+        <w:t xml:space="preserve">“≥64”</w:t>
+      </w:r>
+      <w:r>
+        <w:t xml:space="preserve"> </w:t>
+      </w:r>
+      <w:r>
+        <w:t xml:space="preserve">como piso. O estrato de 79 é o de maior plausibilidade de implantação sem comprar tomógrafo, mas software, sincronização, injetora e leitores habilitados não constam do cadastro. O gargalo previsível é a equipe, não o equipamento: o telelaudo supre a leitura, não a aquisição. Com doze UFs sem estabelecimento pronto, incorporar sem estratégia regional consolidaria a desigualdade.</w:t>
+      </w:r>
+    </w:p>
+    <w:bookmarkEnd w:id="19"/>
+    <w:bookmarkStart w:id="20" w:name="X21724466955795d425e4022be45fd0d969d9249"/>
+    <w:p>
+      <w:pPr>
+        <w:pStyle w:val="Heading3"/>
+      </w:pPr>
+      <w:r>
+        <w:t xml:space="preserve">A literatura econômica, lida pela mesma chave</w:t>
+      </w:r>
+    </w:p>
+    <w:p>
+      <w:pPr>
+        <w:pStyle w:val="FirstParagraph"/>
+      </w:pPr>
+      <w:r>
+        <w:t xml:space="preserve">Os ensaios com desfecho de custo confirmam o sinal que a Tabela 2 prevê. O PROMISE, com comparador majoritariamente cintilográfico, não encontrou economia aos 90 dias nem aos 3 anos.</w:t>
+      </w:r>
+      <w:r>
+        <w:rPr>
+          <w:vertAlign w:val="superscript"/>
+        </w:rPr>
+        <w:t xml:space="preserve">27</w:t>
+      </w:r>
+      <w:r>
+        <w:t xml:space="preserve"> </w:t>
+      </w:r>
+      <w:r>
+        <w:t xml:space="preserve">O SCOT-HEART custou +US$ 462 por paciente aos 6 meses, sem diferença a jusante.</w:t>
+      </w:r>
+      <w:r>
+        <w:rPr>
+          <w:vertAlign w:val="superscript"/>
+        </w:rPr>
+        <w:t xml:space="preserve">1</w:t>
+      </w:r>
+      <w:r>
+        <w:t xml:space="preserve"> </w:t>
+      </w:r>
+      <w:r>
+        <w:t xml:space="preserve">O PRECISE reduziu o custo diagnóstico em 27% mas aumentou o de revascularização em 67%.</w:t>
+      </w:r>
+      <w:r>
+        <w:rPr>
+          <w:vertAlign w:val="superscript"/>
+        </w:rPr>
+        <w:t xml:space="preserve">21</w:t>
+      </w:r>
+      <w:r>
+        <w:t xml:space="preserve"> </w:t>
+      </w:r>
+      <w:r>
+        <w:t xml:space="preserve">No Brasil, os modelos de custo-efetividade de longo prazo de Bertoldi</w:t>
+      </w:r>
+      <w:r>
+        <w:rPr>
+          <w:vertAlign w:val="superscript"/>
+        </w:rPr>
+        <w:t xml:space="preserve">12,13</w:t>
+      </w:r>
+      <w:r>
+        <w:t xml:space="preserve"> </w:t>
+      </w:r>
+      <w:r>
+        <w:t xml:space="preserve">respondem a uma pergunta distinta (benefício clínico ao longo do tempo), não contraditória; e o microcusteio de Carmo</w:t>
+      </w:r>
+      <w:r>
+        <w:rPr>
+          <w:vertAlign w:val="superscript"/>
+        </w:rPr>
+        <w:t xml:space="preserve">14</w:t>
+      </w:r>
+      <w:r>
+        <w:t xml:space="preserve"> </w:t>
+      </w:r>
+      <w:r>
+        <w:t xml:space="preserve">precificou a angioTC (R$ 452) contra comparadores de tabela, a mesma assimetria que este estudo herda e declara.</w:t>
       </w:r>
     </w:p>
     <w:p>
@@ -1629,273 +1729,29 @@
         <w:pStyle w:val="BodyText"/>
       </w:pPr>
       <w:r>
-        <w:t xml:space="preserve">Na probabilidade baixa, as diretrizes recomendam diferir ou usar escore de cálcio, enquanto o SUS faz uma ergometria de R$ 32: a angioTC não substitui nada de valor e é expansiva a qualquer preço plausível. Na intermediária, a ecocardiografia a R$ 196 não financia a troca; a cintilografia a R$ 787 financia, até que a revascularização adicional traga o preço de neutralidade de volta a R$ 458–560, cercando os R$ 550 propostos. Só no filtro antes de uma cinecoronariografia já indicada a angioTC cruza o limiar com folga.</w:t>
-      </w:r>
-    </w:p>
-    <w:p>
-      <w:pPr>
-        <w:pStyle w:val="BodyText"/>
-      </w:pPr>
-      <w:r>
-        <w:t xml:space="preserve">O cenário aditivo, a angioTC somada ao percurso sem substituir nada, é o mais desfavorável e, a nosso juízo, o mais provável se a incorporação criar o código sem protocolo. No SUS, a ergometria costuma preceder o encaminhamento ao cardiologista, e a própria Diretriz SBC de SCC 2025 sugere,</w:t>
-      </w:r>
-      <w:r>
-        <w:t xml:space="preserve"> </w:t>
-      </w:r>
-      <w:r>
-        <w:t xml:space="preserve">“se [capacidade funcional] preservada, iniciar com TE ou ecocardiograma de estresse”</w:t>
-      </w:r>
-      <w:r>
-        <w:t xml:space="preserve">;</w:t>
+        <w:t xml:space="preserve">O confronto mais instrutivo é com Shiozaki et al.,</w:t>
       </w:r>
       <w:r>
         <w:rPr>
           <w:vertAlign w:val="superscript"/>
         </w:rPr>
-        <w:t xml:space="preserve">9</w:t>
-      </w:r>
-      <w:r>
-        <w:t xml:space="preserve"> </w:t>
-      </w:r>
-      <w:r>
-        <w:t xml:space="preserve">uma angioTC solicitada na especialidade chega depois dela, não em seu lugar. É juízo sobre implementação, não medida. Assim,</w:t>
-      </w:r>
-      <w:r>
-        <w:t xml:space="preserve"> </w:t>
-      </w:r>
-      <w:r>
-        <w:t xml:space="preserve">“primeira linha”</w:t>
-      </w:r>
-      <w:r>
-        <w:t xml:space="preserve"> </w:t>
-      </w:r>
-      <w:r>
-        <w:t xml:space="preserve">no SUS como ele é significa substituir a ergometria, e isso não fecha a nenhum preço plausível. A angioTC paga quando entra depois da ergometria: no lugar do encaminhamento à cintilografia (intermediária com protocolo) ou da cinecoronariografia eletiva já indicada (filtro). Capacidade e posicionamento apontam para o mesmo lugar: os 79 estabelecimentos prontos são hospitais com hemodinâmica, exatamente onde o paciente referenciado ao cateterismo já está.</w:t>
-      </w:r>
-    </w:p>
-    <w:bookmarkEnd w:id="18"/>
-    <w:bookmarkStart w:id="19" w:name="o-que-dizem-as-diretrizes"/>
-    <w:p>
-      <w:pPr>
-        <w:pStyle w:val="Heading3"/>
-      </w:pPr>
-      <w:r>
-        <w:t xml:space="preserve">O que dizem as diretrizes</w:t>
-      </w:r>
-    </w:p>
-    <w:p>
-      <w:pPr>
-        <w:pStyle w:val="FirstParagraph"/>
-      </w:pPr>
-      <w:r>
-        <w:t xml:space="preserve">Das cinco diretrizes vigentes, apenas o NICE</w:t>
+        <w:t xml:space="preserve">15</w:t>
+      </w:r>
+      <w:r>
+        <w:t xml:space="preserve"> </w:t>
+      </w:r>
+      <w:r>
+        <w:t xml:space="preserve">o estudo mais recente e mais presente no debate público, que estima economia de R$ 1.021 por beneficiário em cinco anos numa carteira de 100.000 vidas da saúde suplementar. Ele compara a angioTC (R$ 1.311,95) com a angiografia invasiva como estratégia inicial (R$ 1.900,79, único comparador), com eventos do DISCHARGE, e declara não ter comparado com testes funcionais. Ou seja, é um modelo do filtro pré-cateterismo, não da primeira linha. Nesse desenho o Δ exigido é 69 por 100, que o DISCHARGE (75,1) alcança. Transposto ao SUS, o mesmo mecanismo sustenta o filtro (R$ 482–868), não a primeira linha, que ao mesmo preço exigiria 154 cateterismos evitados por 100 pacientes. Mesma tecnologia, sinal oposto: não pelos preços relativos, mas pelo comparador. A economia, ademais, é por beneficiário de carteira, não por paciente examinado; as projeções de dezenas de bilhões veiculadas na imprensa não constam do artigo, que as qualifica como projeção teórica para a saúde suplementar.</w:t>
       </w:r>
       <w:r>
         <w:rPr>
           <w:vertAlign w:val="superscript"/>
         </w:rPr>
-        <w:t xml:space="preserve">5</w:t>
-      </w:r>
-      <w:r>
-        <w:t xml:space="preserve"> </w:t>
-      </w:r>
-      <w:r>
-        <w:t xml:space="preserve">posiciona a angioTC como primeira linha uniforme na faixa</w:t>
-      </w:r>
-      <w:r>
-        <w:t xml:space="preserve"> </w:t>
-      </w:r>
-      <w:r>
-        <w:t xml:space="preserve">“baixa ou intermediária”</w:t>
-      </w:r>
-      <w:r>
-        <w:t xml:space="preserve">; as demais estratificam (Tabela S5). A ESC 2024</w:t>
-      </w:r>
-      <w:r>
-        <w:rPr>
-          <w:vertAlign w:val="superscript"/>
-        </w:rPr>
-        <w:t xml:space="preserve">7</w:t>
-      </w:r>
-      <w:r>
-        <w:t xml:space="preserve"> </w:t>
-      </w:r>
-      <w:r>
-        <w:t xml:space="preserve">a considera preferida só na probabilidade de 5–50% e recomenda imagem funcional a partir de 15%. A AHA/ACC 2021</w:t>
-      </w:r>
-      <w:r>
-        <w:rPr>
-          <w:vertAlign w:val="superscript"/>
-        </w:rPr>
-        <w:t xml:space="preserve">6</w:t>
-      </w:r>
-      <w:r>
-        <w:t xml:space="preserve"> </w:t>
-      </w:r>
-      <w:r>
-        <w:t xml:space="preserve">trata angioTC e imagem de estresse como co-iguais no risco intermediário-alto e, no baixo, recomenda escore de cálcio ou ergometria. O pedido submetido reproduz a formulação da Diretriz SBC/CBR de TC/RM 2024,</w:t>
-      </w:r>
-      <w:r>
-        <w:rPr>
-          <w:vertAlign w:val="superscript"/>
-        </w:rPr>
-        <w:t xml:space="preserve">8</w:t>
-      </w:r>
-      <w:r>
-        <w:t xml:space="preserve"> </w:t>
-      </w:r>
-      <w:r>
-        <w:t xml:space="preserve">que não distingue as faixas; mas a Diretriz SBC de Síndrome Coronariana Crônica 2025,</w:t>
-      </w:r>
-      <w:r>
-        <w:rPr>
-          <w:vertAlign w:val="superscript"/>
-        </w:rPr>
-        <w:t xml:space="preserve">9</w:t>
-      </w:r>
-      <w:r>
-        <w:t xml:space="preserve"> </w:t>
-      </w:r>
-      <w:r>
-        <w:t xml:space="preserve">posterior e específica, separa a baixa (IIb-B) da intermediária (I-A) e condiciona a escolha do exame inicial ao serviço e ao paciente: capacidade funcional, ECG basal, acesso local e função renal. A diretriz não diz qual exame a angioTC substitui; diz que depende, que é a tese deste artigo. O filtro antes de cinecoronariografia já indicada é endossado, em graus diferentes, por quatro das cinco diretrizes, e é a indicação com maior espaço econômico, embora não seja a que foi requerida.</w:t>
-      </w:r>
-    </w:p>
-    <w:bookmarkEnd w:id="19"/>
-    <w:bookmarkStart w:id="20" w:name="capacidade"/>
-    <w:p>
-      <w:pPr>
-        <w:pStyle w:val="Heading3"/>
-      </w:pPr>
-      <w:r>
-        <w:t xml:space="preserve">Capacidade</w:t>
-      </w:r>
-    </w:p>
-    <w:p>
-      <w:pPr>
-        <w:pStyle w:val="FirstParagraph"/>
-      </w:pPr>
-      <w:r>
-        <w:t xml:space="preserve">O CNES agora permite contar tomógrafos por canais, mas 74,6% dos estabelecimentos ainda não migraram: os 432 são piso. Dos 432, 293 são de 64 canais, faixa em que equipamentos de gerações antigas entregam dose muito maior em aquisição retrospectiva; o CNES não registra geração nem ano, mais um motivo para tratar</w:t>
-      </w:r>
-      <w:r>
-        <w:t xml:space="preserve"> </w:t>
-      </w:r>
-      <w:r>
-        <w:t xml:space="preserve">“≥64”</w:t>
-      </w:r>
-      <w:r>
-        <w:t xml:space="preserve"> </w:t>
-      </w:r>
-      <w:r>
-        <w:t xml:space="preserve">como piso. O estrato de 79 é o de maior plausibilidade de implantação sem comprar tomógrafo, mas software, sincronização, injetora e leitores habilitados não constam do cadastro. O gargalo previsível é a equipe, não o equipamento: o telelaudo supre a leitura, não a aquisição. Com doze UFs sem estabelecimento pronto, incorporar sem estratégia regional consolidaria a desigualdade.</w:t>
+        <w:t xml:space="preserve">28</w:t>
       </w:r>
     </w:p>
     <w:bookmarkEnd w:id="20"/>
-    <w:bookmarkStart w:id="21" w:name="X21724466955795d425e4022be45fd0d969d9249"/>
-    <w:p>
-      <w:pPr>
-        <w:pStyle w:val="Heading3"/>
-      </w:pPr>
-      <w:r>
-        <w:t xml:space="preserve">A literatura econômica, lida pela mesma chave</w:t>
-      </w:r>
-    </w:p>
-    <w:p>
-      <w:pPr>
-        <w:pStyle w:val="FirstParagraph"/>
-      </w:pPr>
-      <w:r>
-        <w:t xml:space="preserve">Os ensaios com desfecho de custo confirmam o sinal que a Tabela 2 prevê. O PROMISE, cujo comparador foi majoritariamente cintilografia, não encontrou economia aos 90 dias nem aos 3 anos.</w:t>
-      </w:r>
-      <w:r>
-        <w:rPr>
-          <w:vertAlign w:val="superscript"/>
-        </w:rPr>
-        <w:t xml:space="preserve">27</w:t>
-      </w:r>
-      <w:r>
-        <w:t xml:space="preserve"> </w:t>
-      </w:r>
-      <w:r>
-        <w:t xml:space="preserve">O SCOT-HEART custou +US$ 462 por paciente aos 6 meses, sem diferença a jusante.</w:t>
-      </w:r>
-      <w:r>
-        <w:rPr>
-          <w:vertAlign w:val="superscript"/>
-        </w:rPr>
-        <w:t xml:space="preserve">1</w:t>
-      </w:r>
-      <w:r>
-        <w:t xml:space="preserve"> </w:t>
-      </w:r>
-      <w:r>
-        <w:t xml:space="preserve">O PRECISE reduziu o custo diagnóstico em 27% mas aumentou o de revascularização em 67%.</w:t>
-      </w:r>
-      <w:r>
-        <w:rPr>
-          <w:vertAlign w:val="superscript"/>
-        </w:rPr>
-        <w:t xml:space="preserve">21</w:t>
-      </w:r>
-      <w:r>
-        <w:t xml:space="preserve"> </w:t>
-      </w:r>
-      <w:r>
-        <w:t xml:space="preserve">No Brasil, os modelos de custo-efetividade de longo prazo de Bertoldi</w:t>
-      </w:r>
-      <w:r>
-        <w:rPr>
-          <w:vertAlign w:val="superscript"/>
-        </w:rPr>
-        <w:t xml:space="preserve">12,13</w:t>
-      </w:r>
-      <w:r>
-        <w:t xml:space="preserve"> </w:t>
-      </w:r>
-      <w:r>
-        <w:t xml:space="preserve">respondem a uma pergunta distinta (benefício clínico ao longo do tempo), não contraditória; e o microcusteio de Carmo</w:t>
-      </w:r>
-      <w:r>
-        <w:rPr>
-          <w:vertAlign w:val="superscript"/>
-        </w:rPr>
-        <w:t xml:space="preserve">14</w:t>
-      </w:r>
-      <w:r>
-        <w:t xml:space="preserve"> </w:t>
-      </w:r>
-      <w:r>
-        <w:t xml:space="preserve">precificou a angioTC (R$ 452) contra comparadores de tabela, a mesma assimetria que este estudo herda e declara.</w:t>
-      </w:r>
-    </w:p>
-    <w:p>
-      <w:pPr>
-        <w:pStyle w:val="BodyText"/>
-      </w:pPr>
-      <w:r>
-        <w:t xml:space="preserve">O confronto mais instrutivo é com Shiozaki et al.,</w:t>
-      </w:r>
-      <w:r>
-        <w:rPr>
-          <w:vertAlign w:val="superscript"/>
-        </w:rPr>
-        <w:t xml:space="preserve">15</w:t>
-      </w:r>
-      <w:r>
-        <w:t xml:space="preserve"> </w:t>
-      </w:r>
-      <w:r>
-        <w:t xml:space="preserve">o estudo mais recente e mais presente no debate público, que estima economia de R$ 1.021 por beneficiário em cinco anos numa carteira de 100.000 vidas da saúde suplementar. Ele compara a angioTC (R$ 1.311,95) com a angiografia invasiva como estratégia inicial (R$ 1.900,79, único comparador), com eventos do DISCHARGE, e declara não ter comparado com testes funcionais. Ou seja, é um modelo do filtro pré-cateterismo, não da primeira linha. Nesse desenho o Δ exigido é 69 por 100, que o DISCHARGE (75,1) alcança. Transposto ao SUS, o mesmo mecanismo sustenta o filtro (R$ 482–868), não a primeira linha, que ao mesmo preço exigiria 154 cateterismos evitados por 100 pacientes. Mesma tecnologia, sinal oposto: não pelos preços relativos, mas pelo comparador. A economia, ademais, é por beneficiário de carteira, não por paciente examinado; as projeções de dezenas de bilhões veiculadas na imprensa não constam do artigo, que as qualifica como projeção teórica para a saúde suplementar.</w:t>
-      </w:r>
-      <w:r>
-        <w:rPr>
-          <w:vertAlign w:val="superscript"/>
-        </w:rPr>
-        <w:t xml:space="preserve">28</w:t>
-      </w:r>
-    </w:p>
-    <w:bookmarkEnd w:id="21"/>
-    <w:bookmarkStart w:id="22" w:name="limitações"/>
+    <w:bookmarkStart w:id="21" w:name="limitações"/>
     <w:p>
       <w:pPr>
         <w:pStyle w:val="Heading3"/>
@@ -1960,14 +1816,41 @@
         <w:t xml:space="preserve">em ao menos oito serviços cobrindo as cinco regiões e as três naturezas, incluindo o estrato pronto (Texto S1).</w:t>
       </w:r>
     </w:p>
+    <w:bookmarkEnd w:id="21"/>
+    <w:bookmarkStart w:id="22" w:name="implicações"/>
+    <w:p>
+      <w:pPr>
+        <w:pStyle w:val="Heading3"/>
+      </w:pPr>
+      <w:r>
+        <w:t xml:space="preserve">Implicações</w:t>
+      </w:r>
+    </w:p>
+    <w:p>
+      <w:pPr>
+        <w:pStyle w:val="FirstParagraph"/>
+      </w:pPr>
+      <w:r>
+        <w:t xml:space="preserve">A pergunta talvez não seja se o SUS deve ter angioTC, mas quais pacientes a recebem primeiro e o que ela substitui. Primeiro, condicionar a incorporação a um protocolo que especifique posicionamento e substituição. Sem ele, o cenário de referência é o aditivo, em que nenhum preço plausível é neutro: a sustentabilidade é propriedade do protocolo, não do preço. O protocolo já existe na Diretriz SBC de SCC 2025, e o instrumento administrativo também: as OCI de síndrome coronariana crônica remuneram por episódio e nomeiam o exame de cada progressão. Uma progressão anatômica, em alternativa à progressão II (cintilografia, R$ 840), incorporaria a substituição no próprio código. O protocolo deve excluir explicitamente o assintomático, indicação de classe III em todas as diretrizes, porque código sem protocolo vira rastreamento.</w:t>
+      </w:r>
+    </w:p>
+    <w:p>
+      <w:pPr>
+        <w:pStyle w:val="BodyText"/>
+      </w:pPr>
+      <w:r>
+        <w:t xml:space="preserve">Segundo, avaliar o filtro antes de cinecoronariografia já indicada como pergunta separada: a indicação com maior espaço econômico e respaldo de diretriz. Terceiro, criar o código SIGTAP e microcustear angioTC e comparadores. Quarto, completar a reclassificação do CNES antes da apreciação final e implantar a partir do estrato pronto, com estratégia regional para as doze UFs sem estabelecimento.</w:t>
+      </w:r>
+    </w:p>
     <w:bookmarkEnd w:id="22"/>
-    <w:bookmarkStart w:id="23" w:name="implicações"/>
-    <w:p>
-      <w:pPr>
-        <w:pStyle w:val="Heading3"/>
-      </w:pPr>
-      <w:r>
-        <w:t xml:space="preserve">Implicações</w:t>
+    <w:bookmarkEnd w:id="23"/>
+    <w:bookmarkStart w:id="24" w:name="conclusão"/>
+    <w:p>
+      <w:pPr>
+        <w:pStyle w:val="Heading2"/>
+      </w:pPr>
+      <w:r>
+        <w:t xml:space="preserve">Conclusão</w:t>
       </w:r>
     </w:p>
     <w:p>
@@ -1975,38 +1858,11 @@
         <w:pStyle w:val="FirstParagraph"/>
       </w:pPr>
       <w:r>
-        <w:t xml:space="preserve">A pergunta talvez não seja se o SUS deve ter acesso à angioTC, mas quais pacientes devem recebê-la primeiro e o que ela substitui quando os recebe. Primeiro, condicionar a incorporação a um protocolo que especifique posicionamento e substituição. Sem ele, o cenário de referência é o aditivo, em que nenhum preço plausível é neutro: a sustentabilidade é propriedade do protocolo, não do preço. O protocolo já existe na Diretriz SBC de SCC 2025, e o instrumento administrativo também: as OCI de síndrome coronariana crônica remuneram por episódio e nomeiam o exame de cada progressão. Uma progressão anatômica, em alternativa à progressão II (cintilografia, R$ 840), incorporaria a substituição no próprio código. O protocolo deve excluir explicitamente o assintomático, indicação de classe III em todas as diretrizes, porque código sem protocolo vira rastreamento.</w:t>
-      </w:r>
-    </w:p>
-    <w:p>
-      <w:pPr>
-        <w:pStyle w:val="BodyText"/>
-      </w:pPr>
-      <w:r>
-        <w:t xml:space="preserve">Segundo, avaliar o filtro antes de cinecoronariografia já indicada como pergunta separada: a indicação com maior espaço econômico e respaldo de diretriz. Terceiro, criar o código SIGTAP e microcustear a angioTC e os comparadores. Quarto, completar a reclassificação do CNES antes da apreciação final e planejar a implantação a partir do estrato pronto, com estratégia regional para as doze UFs sem estabelecimento.</w:t>
-      </w:r>
-    </w:p>
-    <w:bookmarkEnd w:id="23"/>
+        <w:t xml:space="preserve">Após a Portaria SAES/MS 3.695/2026, o cadastro nacional responde pela primeira vez à pergunta de capacidade: 432 tomógrafos de ≥64 canais em 315 estabelecimentos, como piso, e 79 prontos, com forte desigualdade regional. A pergunta orçamentária, por sua vez, não tem resposta única, e isso é o achado. Sem protocolo, a angioTC entra somada ao percurso e nenhum preço plausível a torna neutra. Com protocolo, é expansiva na probabilidade baixa, incerta na intermediária quando substitui a cintilografia (e apenas ela), e tem espaço como filtro antes de uma cinecoronariografia já indicada. Essa estratificação já está na Diretriz de Síndrome Coronariana Crônica da SBC de 2025, posterior à formulação que o pedido reproduz. A evidência econômica não sustenta uma decisão uniforme para toda a faixa baixa ou intermediária; sustenta condicionar qualquer incorporação ao posicionamento e ao exame substituído, com o protocolo que a cardiologia brasileira já publicou, e avaliar em separado, com critérios próprios, o filtro antes da cinecoronariografia já indicada, onde o espaço econômico é maior e o estrato pronto já está.</w:t>
+      </w:r>
+    </w:p>
     <w:bookmarkEnd w:id="24"/>
-    <w:bookmarkStart w:id="25" w:name="conclusão"/>
-    <w:p>
-      <w:pPr>
-        <w:pStyle w:val="Heading2"/>
-      </w:pPr>
-      <w:r>
-        <w:t xml:space="preserve">Conclusão</w:t>
-      </w:r>
-    </w:p>
-    <w:p>
-      <w:pPr>
-        <w:pStyle w:val="FirstParagraph"/>
-      </w:pPr>
-      <w:r>
-        <w:t xml:space="preserve">Após a Portaria SAES/MS 3.695/2026, o cadastro nacional responde pela primeira vez à pergunta de capacidade: 432 tomógrafos de ≥64 canais em 315 estabelecimentos, como piso, e 79 prontos, com forte desigualdade regional. A pergunta orçamentária, por sua vez, não tem resposta única, e isso é o achado. Sem protocolo, a angioTC entra somada ao percurso, e nenhum preço plausível a torna neutra. Com protocolo, é expansiva na probabilidade baixa, incerta na intermediária quando substitui a cintilografia (e apenas ela), e tem espaço como filtro antes de uma cinecoronariografia já indicada. Essa estratificação já está escrita na Diretriz de Síndrome Coronariana Crônica da SBC de 2025, posterior à formulação que o pedido reproduz. A evidência econômica não sustenta uma decisão uniforme para toda a faixa baixa ou intermediária; sustenta condicionar qualquer incorporação ao posicionamento e ao exame substituído, com o protocolo que a cardiologia brasileira já publicou, e avaliar em separado, com critérios próprios, o filtro antes da cinecoronariografia já indicada, onde o espaço econômico é maior e o estrato pronto já está.</w:t>
-      </w:r>
-    </w:p>
-    <w:bookmarkEnd w:id="25"/>
-    <w:bookmarkStart w:id="26" w:name="legendas"/>
+    <w:bookmarkStart w:id="25" w:name="legendas"/>
     <w:p>
       <w:pPr>
         <w:pStyle w:val="Heading2"/>
@@ -2078,8 +1934,8 @@
         <w:t xml:space="preserve">Preço de neutralidade em função do Δ de cateterismo total por 100 pacientes. Retas de primeira linha com C_substituído = R$ 0 (aditiva), R$ 185 (mix) e R$ 787 (cintilografia), e reta do filtro pré-cateterismo. Δ de dez ensaios e uma metanálise; preços de referência.</w:t>
       </w:r>
     </w:p>
-    <w:bookmarkEnd w:id="26"/>
-    <w:bookmarkStart w:id="27" w:name="referências"/>
+    <w:bookmarkEnd w:id="25"/>
+    <w:bookmarkStart w:id="26" w:name="referências"/>
     <w:p>
       <w:pPr>
         <w:pStyle w:val="Heading2"/>
@@ -2436,8 +2292,8 @@
         <w:t xml:space="preserve">Brasil. Ministério da Saúde. Diretriz metodológica: estudos de microcusteio aplicados a avaliações econômicas em saúde. Brasília; 2021.</w:t>
       </w:r>
     </w:p>
+    <w:bookmarkEnd w:id="26"/>
     <w:bookmarkEnd w:id="27"/>
-    <w:bookmarkEnd w:id="28"/>
     <w:sectPr>
       <w:footnotePr>
         <w:numRestart w:val="eachSect"/>

</xml_diff>

<commit_message>
docs: reconta corpo em 5.000 após a frase de disponibilidade de dados
Co-Authored-By: Claude Fable 5 <noreply@anthropic.com>
</commit_message>
<xml_diff>
--- a/submissao-abc/manuscrito-cego.docx
+++ b/submissao-abc/manuscrito-cego.docx
@@ -326,7 +326,7 @@
         <w:t xml:space="preserve"> </w:t>
       </w:r>
       <w:r>
-        <w:t xml:space="preserve">o desmembrou por número de canais. Este estudo usa esse novo cadastro para caracterizar a capacidade compatível com angioTC e uma análise de limiar para determinar, por posição no percurso e por estrato de probabilidade pré-teste, a que preço a tecnologia é orçamentariamente neutra, com dados públicos e método reproduzível.</w:t>
+        <w:t xml:space="preserve">o desmembrou por número de canais. Este estudo usa esse cadastro para caracterizar a capacidade compatível com angioTC e uma análise de limiar para determinar, por posição no percurso e estrato de probabilidade pré-teste, a que preço a tecnologia é neutra, com dados públicos e método reproduzível.</w:t>
       </w:r>
     </w:p>
     <w:bookmarkEnd w:id="10"/>
@@ -384,7 +384,7 @@
         <w:t xml:space="preserve"> </w:t>
       </w:r>
       <w:r>
-        <w:t xml:space="preserve">CNES para equipamentos (06/2026); SIA/SUS e SIH/SUS para produção (2025, 27 UFs, todos os arquivos processados sem perda); SIGTAP para preços (08/2026); IBGE para população e IPCA. Todo o acesso foi por FTP público (Tabela S1).</w:t>
+        <w:t xml:space="preserve">CNES para equipamentos (06/2026); SIA/SUS e SIH/SUS para produção (2025, 27 UFs, todos os arquivos processados sem perda); SIGTAP para preços (08/2026); IBGE para população e IPCA. Acesso por FTP público (Tabela S1).</w:t>
       </w:r>
     </w:p>
     <w:p>
@@ -501,7 +501,7 @@
         <w:t xml:space="preserve"> </w:t>
       </w:r>
       <w:r>
-        <w:t xml:space="preserve">Um único script regenera todas as tabelas a partir dos microdados versionados e recusa cobertura parcial. Código e dados serão depositados em repositório público com DOI na publicação; até lá, disponíveis aos revisores.</w:t>
+        <w:t xml:space="preserve">Um único script regenera todas as tabelas dos microdados versionados e recusa cobertura parcial. Código e dados serão depositados em repositório público com DOI na publicação; até lá, disponíveis aos revisores.</w:t>
       </w:r>
     </w:p>
     <w:bookmarkEnd w:id="11"/>
@@ -1613,7 +1613,7 @@
         <w:t xml:space="preserve"> </w:t>
       </w:r>
       <w:r>
-        <w:t xml:space="preserve">posterior e específica, separa a baixa (IIb-B) da intermediária (I-A) e condiciona a escolha do exame inicial ao serviço e ao paciente: capacidade funcional, ECG basal, acesso local e função renal. A diretriz não diz qual exame a angioTC substitui; diz que depende, que é a tese deste artigo. O filtro antes de cinecoronariografia já indicada é endossado, em graus diferentes, por quatro das cinco diretrizes, e é a indicação com maior espaço econômico, embora não seja a que foi requerida.</w:t>
+        <w:t xml:space="preserve">posterior e específica, separa a baixa (IIb-B) da intermediária (I-A) e condiciona a escolha do exame inicial ao serviço e ao paciente: capacidade funcional, ECG basal, acesso local e função renal. A diretriz não diz qual exame a angioTC substitui; diz que depende, que é a tese deste artigo. O filtro antes de cinecoronariografia já indicada é endossado, em graus diferentes, por quatro das cinco diretrizes, e é a indicação com maior espaço econômico, embora não seja a requerida.</w:t>
       </w:r>
     </w:p>
     <w:bookmarkEnd w:id="18"/>
@@ -1741,7 +1741,7 @@
         <w:t xml:space="preserve"> </w:t>
       </w:r>
       <w:r>
-        <w:t xml:space="preserve">o estudo mais recente e mais presente no debate público, que estima economia de R$ 1.021 por beneficiário em cinco anos numa carteira de 100.000 vidas da saúde suplementar. Ele compara a angioTC (R$ 1.311,95) com a angiografia invasiva como estratégia inicial (R$ 1.900,79, único comparador), com eventos do DISCHARGE, e declara não ter comparado com testes funcionais. Ou seja, é um modelo do filtro pré-cateterismo, não da primeira linha. Nesse desenho o Δ exigido é 69 por 100, que o DISCHARGE (75,1) alcança. Transposto ao SUS, o mesmo mecanismo sustenta o filtro (R$ 482–868), não a primeira linha, que ao mesmo preço exigiria 154 cateterismos evitados por 100 pacientes. Mesma tecnologia, sinal oposto: não pelos preços relativos, mas pelo comparador. A economia, ademais, é por beneficiário de carteira, não por paciente examinado; as projeções de dezenas de bilhões veiculadas na imprensa não constam do artigo, que as qualifica como projeção teórica para a saúde suplementar.</w:t>
+        <w:t xml:space="preserve">o mais recente e mais presente no debate público, que estima economia de R$ 1.021 por beneficiário em cinco anos numa carteira de 100.000 vidas da saúde suplementar. Ele compara a angioTC (R$ 1.311,95) com a angiografia invasiva como estratégia inicial (R$ 1.900,79, único comparador), com eventos do DISCHARGE, e declara não ter comparado com testes funcionais. Ou seja, é um modelo do filtro pré-cateterismo, não da primeira linha. Nesse desenho o Δ exigido é 69 por 100, que o DISCHARGE (75,1) alcança. Transposto ao SUS, o mesmo mecanismo sustenta o filtro (R$ 482–868), não a primeira linha, que ao mesmo preço exigiria 154 cateterismos evitados por 100 pacientes. Mesma tecnologia, sinal oposto: não pelos preços relativos, mas pelo comparador. A economia, ademais, é por beneficiário de carteira, não por paciente examinado; as projeções de dezenas de bilhões veiculadas na imprensa não constam do artigo, que as qualifica como projeção teórica para a saúde suplementar.</w:t>
       </w:r>
       <w:r>
         <w:rPr>
@@ -1765,7 +1765,7 @@
         <w:pStyle w:val="FirstParagraph"/>
       </w:pPr>
       <w:r>
-        <w:t xml:space="preserve">A principal limitação é de dado: sem identificador de paciente, a análise responde a uma pergunta inversa, não a uma estimativa de procedimentos evitados. A probabilidade pré-teste não está nos registros, de modo que a estratificação é premissa declarada, e os denominadores incluem assintomáticos e doença conhecida. O código de cateterismo é genérico e o CNES é autodeclarado e incompleto. Quanto ao modelo: os preços são de tabela, não custos, inclusive o do cateterismo, que credita cada Δ (se seu custo real for maior, o filtro melhora e a primeira linha não muda); a substituição é tratada como 1:1; e o horizonte curto exclui de propósito o benefício do SCOT-HEART aos 5 e 10 anos,</w:t>
+        <w:t xml:space="preserve">A principal limitação é de dado: sem identificador de paciente, a análise responde a uma pergunta inversa, não a uma estimativa. A probabilidade pré-teste não está nos registros, de modo que a estratificação é premissa declarada, e os denominadores incluem assintomáticos e doença conhecida. O código de cateterismo é genérico e o CNES é autodeclarado e incompleto. Quanto ao modelo: os preços são de tabela, não custos, inclusive o do cateterismo, que credita cada Δ (se seu custo real for maior, o filtro melhora e a primeira linha não muda); a substituição é tratada como 1:1; e o horizonte curto exclui de propósito o benefício do SCOT-HEART aos 5 e 10 anos,</w:t>
       </w:r>
       <w:r>
         <w:rPr>

</xml_diff>

<commit_message>
docs: observações do coautor — deslocamento evitado e os 236 estabelecimentos ≥64 sem hemodinâmica (filtro na origem; estrato de 79 conservador); insumos (contraste, nitrato, betabloqueador) e oscilação de oferta no preço proposto; artigo recontado em 5.000
Co-Authored-By: Claude Fable 5 <noreply@anthropic.com>
</commit_message>
<xml_diff>
--- a/submissao-abc/manuscrito-cego.docx
+++ b/submissao-abc/manuscrito-cego.docx
@@ -402,7 +402,7 @@
         <w:t xml:space="preserve"> </w:t>
       </w:r>
       <w:r>
-        <w:t xml:space="preserve">A Portaria SAES/MS 3.695/2026 desmembrou o código genérico de tomógrafo em categorias por número de canais. Classificamos cada equipamento disponível ao SUS e em uso como compatível confirmado (≥64 canais, piso adotado por coerência com o NICE, a ESC e o relatório preliminar), incompatível confirmado (&lt;64) ou sem especificação declarada. Sobre os compatíveis, definimos estratos de prontidão crescente: presença de hemodinâmica no mesmo estabelecimento e, além dela, produção coronariana invasiva registrada no SIH em 2025 (Tabela S2). A distribuição foi medida por densidade por milhão de habitantes e a desigualdade por coeficiente de variação e índice de Gini ponderado por população.</w:t>
+        <w:t xml:space="preserve">A Portaria SAES/MS 3.695/2026 desmembrou o código genérico de tomógrafo em categorias por número de canais. Classificamos cada equipamento disponível ao SUS e em uso como compatível confirmado (≥64 canais, piso adotado por coerência com o NICE, a ESC e o relatório preliminar), incompatível confirmado (&lt;64) ou sem especificação declarada. Sobre os compatíveis, definimos estratos de prontidão crescente: hemodinâmica no mesmo estabelecimento e, além dela, produção coronariana invasiva registrada no SIH em 2025 (Tabela S2). A distribuição foi medida por densidade por milhão e a desigualdade por coeficiente de variação e Gini ponderado por população.</w:t>
       </w:r>
     </w:p>
     <w:p>
@@ -438,7 +438,7 @@
         <w:t xml:space="preserve"> </w:t>
       </w:r>
       <w:r>
-        <w:t xml:space="preserve">O SIA não tem identificador de paciente, e razões entre contagens agregadas não são probabilidades condicionais: não permitem estimar quantos cateterismos a angioTC evitaria. Invertemos a pergunta e calculamos, a cada preço, o Δ de cateterismo total por 100 pacientes necessário para a neutralidade orçamentária. Na primeira linha, o preço de neutralidade é o custo do exame substituído mais o dos cateterismos induzidos, menos o das revascularizações induzidas. No filtro antes de uma cinecoronariografia eletiva já indicada, a investigação prévia é comum aos dois braços e se cancela, restando apenas o crédito dos cateterismos e revascularizações evitados. Adotamos C_CATE = R$ 730,14 (SIA 2025; sensibilidade a R$ 772,80, pela AIH) e os custos de revascularização do SIH 2025 (R$ 7.713 por angioplastia e R$ 25.904 por cirurgia); a revascularização não desagregada é valorada como angioplastia. Preços de referência: R$ 196,41 (TC de tórax com contraste, proxy), R$ 550,00 (demandante), R$ 622,54 (microcusteio de 2022</w:t>
+        <w:t xml:space="preserve">O SIA não tem identificador de paciente, e razões entre contagens agregadas não são probabilidades condicionais: não estimam quantos cateterismos a angioTC evitaria. Invertemos a pergunta e calculamos, a cada preço, o Δ de cateterismo total por 100 pacientes necessário para a neutralidade orçamentária. Na primeira linha, o preço de neutralidade é o custo do exame substituído mais o dos cateterismos induzidos, menos o das revascularizações induzidas. No filtro antes de uma cinecoronariografia eletiva já indicada, a investigação prévia é comum aos dois braços e se cancela, restando apenas o crédito dos cateterismos e revascularizações evitados. Adotamos C_CATE = R$ 730,14 (SIA 2025; sensibilidade a R$ 772,80, pela AIH) e os custos de revascularização do SIH 2025 (R$ 7.713 por angioplastia e R$ 25.904 por cirurgia); a revascularização não desagregada é valorada como angioplastia. Preços de referência: R$ 196,41 (TC de tórax com contraste, proxy), R$ 550,00 (demandante), R$ 622,54 (microcusteio de 2022</w:t>
       </w:r>
       <w:r>
         <w:rPr>
@@ -528,7 +528,7 @@
         <w:pStyle w:val="FirstParagraph"/>
       </w:pPr>
       <w:r>
-        <w:t xml:space="preserve">Em junho de 2026, o SUS dispunha de 432 tomógrafos de ≥64 canais confirmados, em 315 estabelecimentos (Tabela 1). Esse número é um piso, não uma estimativa: 74,6% dos estabelecimentos ainda não haviam migrado do código genérico, de modo que 2.785 equipamentos permanecem sem especificação de canais e uma fração desconhecida deles é também compatível. Dos 315 estabelecimentos, 79 reúnem, além do hardware, sala de hemodinâmica e produção coronariana invasiva documentada em 2025: o estrato com maior plausibilidade de implantar a angioTC sem adquirir tomógrafo.</w:t>
+        <w:t xml:space="preserve">Em junho de 2026, o SUS dispunha de 432 tomógrafos de ≥64 canais confirmados, em 315 estabelecimentos (Tabela 1). Esse número é um piso, não uma estimativa: 74,6% dos estabelecimentos ainda não haviam migrado do código genérico, de modo que 2.785 equipamentos permanecem sem especificação de canais e uma fração desconhecida deles é também compatível. Dos 315, 79 reúnem, além do hardware, hemodinâmica e produção coronariana invasiva documentada em 2025: o estrato com maior plausibilidade de implantar a angioTC sem adquirir tomógrafo.</w:t>
       </w:r>
     </w:p>
     <w:p>
@@ -852,7 +852,7 @@
         <w:pStyle w:val="BodyText"/>
       </w:pPr>
       <w:r>
-        <w:t xml:space="preserve">A capacidade compatível é escassa e desigual. A densidade nacional é de 2,02 equipamentos ≥64 canais por milhão de habitantes; Amapá, Piauí e Tocantins não têm nenhum, e doze UFs não têm nenhum estabelecimento no estrato pronto. A desigualdade é mais acentuada sobre o hardware compatível do que sobre o parque total (coeficiente de variação 0,86 contra 0,32; Gini 0,30 contra 0,14), de modo que projeções ancoradas no total de tomógrafos superestimam a capacidade de fato acessível (Figura 1).</w:t>
+        <w:t xml:space="preserve">A capacidade compatível é escassa e desigual: 2,02 equipamentos ≥64 canais por milhão de habitantes; Amapá, Piauí e Tocantins não têm nenhum, e doze UFs não têm estabelecimento pronto. A desigualdade é mais acentuada sobre o hardware compatível do que sobre o parque total (coeficiente de variação 0,86 contra 0,32; Gini 0,30 contra 0,14), de modo que projeções ancoradas no total de tomógrafos superestimam a capacidade de fato acessível (Figura 1).</w:t>
       </w:r>
     </w:p>
     <w:bookmarkEnd w:id="12"/>
@@ -870,7 +870,7 @@
         <w:pStyle w:val="FirstParagraph"/>
       </w:pPr>
       <w:r>
-        <w:t xml:space="preserve">Em 2025 o SUS realizou 787.954 episódios de investigação funcional, a R$ 146,1 milhões (R$ 185,46 por episódio). O volume e o gasto moram em exames diferentes: o teste ergométrico responde por 76% dos episódios mas só 13% do gasto (R$ 32 cada), enquanto a cintilografia de perfusão responde por 19% dos episódios e 82% do gasto (R$ 787 cada). A ecocardiografia de estresse somou 33.766 episódios (R$ 196 cada) e as OCI de síndrome coronariana crônica, apenas 0,96% do total. Houve 163.803 cateterismos (R$ 730,14), 133.934 angioplastias (R$ 7.713) e 23.290 revascularizações cirúrgicas (R$ 25.904). Não existe código para a angioTC, e o de contraste para tomografia tem faturamento zero: a produção que exista é administrativamente invisível.</w:t>
+        <w:t xml:space="preserve">Em 2025 o SUS realizou 787.954 episódios de investigação funcional, a R$ 146,1 milhões (R$ 185,46 por episódio). Volume e gasto moram em exames diferentes: o teste ergométrico responde por 76% dos episódios e 13% do gasto (R$ 32 cada); a cintilografia de perfusão, por 19% e 82% (R$ 787 cada). A ecocardiografia de estresse somou 33.766 episódios (R$ 196 cada) e as OCI de síndrome coronariana crônica, apenas 0,96% do total. Houve 163.803 cateterismos (R$ 730,14), 133.934 angioplastias (R$ 7.713) e 23.290 revascularizações cirúrgicas (R$ 25.904). Não existe código para a angioTC, e o de contraste para tomografia tem faturamento zero: a produção que exista é administrativamente invisível.</w:t>
       </w:r>
     </w:p>
     <w:bookmarkEnd w:id="13"/>
@@ -888,7 +888,7 @@
         <w:pStyle w:val="FirstParagraph"/>
       </w:pPr>
       <w:r>
-        <w:t xml:space="preserve">Nos ensaios de primeira linha, o Δ de cateterismo variou de −6,3 (CAPP) a +4,1 por 100 (PRECISE); contra cateterismo direto, de 66,0 (CONSERVE) a 85,6 (CAD-MAN) (Figura 2; Tabela S3). O preço de neutralidade depende inteiramente do que a angioTC substitui e de onde entra (Tabela 2).</w:t>
+        <w:t xml:space="preserve">Nos ensaios de primeira linha, o Δ de cateterismo variou de −6,3 (CAPP) a +4,1 por 100 (PRECISE); contra cateterismo direto, de 66,0 (CONSERVE) a 85,6 (CAD-MAN) (Figura 2; Tabela S3). O preço de neutralidade depende do que a angioTC substitui e de onde entra (Tabela 2).</w:t>
       </w:r>
     </w:p>
     <w:p>
@@ -896,7 +896,7 @@
         <w:pStyle w:val="BodyText"/>
       </w:pPr>
       <w:r>
-        <w:t xml:space="preserve">Como primeira linha, no PICO agregado, nenhum preço plausível fecha. Sem substituir nada (a adoção aditiva, cenário de referência quando não há protocolo), o teto de neutralidade é R$ 30 por exame, abaixo do menor preço de referência. Com o comparador que as diretrizes indicam em cada faixa, o quadro não melhora: na probabilidade baixa (nenhum exame ou ergometria), R$ 550 está muito fora do alcance; na intermediária, só entra na zona de incerteza quando substitui a cintilografia, e ainda assim a revascularização induzida o traz de volta a R$ 458–560. Substituindo a ecocardiografia, R$ 550 fica fora. O nicho da cintilografia tem no máximo 151.784 episódios por ano, e a fração substituível é menor: parte é feita em doença conhecida e parte em pacientes idosos, obesos, com fibrilação atrial ou calcificação extensa, nos quais a angioTC rende pior. A média não estratificada é puxada para o estrato baixo, porque três quartos do volume atual são ergometria. Ao preço da saúde suplementar, a primeira linha substituindo o mix médio exigiria mais cateterismos evitados do que pacientes (154 por 100).</w:t>
+        <w:t xml:space="preserve">Como primeira linha, no PICO agregado, nenhum preço plausível fecha. Sem substituir nada (a adoção aditiva, cenário de referência quando não há protocolo), o teto de neutralidade é R$ 30 por exame, abaixo do menor preço de referência. Com o comparador que as diretrizes indicam em cada faixa, não melhora: na probabilidade baixa (nenhum exame ou ergometria), R$ 550 está muito fora do alcance; na intermediária, só entra na zona de incerteza quando substitui a cintilografia, e ainda assim a revascularização induzida o traz de volta a R$ 458–560. Substituindo a ecocardiografia, R$ 550 fica fora. O nicho da cintilografia tem no máximo 151.784 episódios por ano, e a fração substituível é menor: parte é feita em doença conhecida e parte em pacientes idosos, obesos, com fibrilação atrial ou calcificação extensa, nos quais a angioTC rende pior. A média não estratificada é puxada para o estrato baixo, porque três quartos do volume atual são ergometria. Ao preço da saúde suplementar, a primeira linha substituindo o mix médio exigiria mais cateterismos evitados do que pacientes (154 por 100).</w:t>
       </w:r>
     </w:p>
     <w:p>
@@ -1437,7 +1437,7 @@
         <w:pStyle w:val="FirstParagraph"/>
       </w:pPr>
       <w:r>
-        <w:t xml:space="preserve">Num segundo desfecho, apresentado como eficiência diagnóstica e mantido fora do cálculo econômico, a angioTC evita cateterismos sem doença obstrutiva em ambos os PICOs: de 0,9 a 5,9 por 100 contra estratégias funcionais (OR 0,77, IC95% 0,64–0,94, nos estudos de alta certeza) e de 53,7 a 81,0 por 100 contra cateterismo direto.</w:t>
+        <w:t xml:space="preserve">Num segundo desfecho, eficiência diagnóstica fora do cálculo econômico, a angioTC evita cateterismos sem doença obstrutiva em ambos os PICOs: de 0,9 a 5,9 por 100 contra estratégias funcionais (OR 0,77, IC95% 0,64–0,94, nos estudos de alta certeza) e de 53,7 a 81,0 por 100 contra cateterismo direto.</w:t>
       </w:r>
       <w:r>
         <w:rPr>
@@ -1449,7 +1449,7 @@
         <w:t xml:space="preserve"> </w:t>
       </w:r>
       <w:r>
-        <w:t xml:space="preserve">A direção favorece a angioTC consistentemente, o que sustenta o ganho de adequação da indicação como o benefício mais robusto no horizonte de curto prazo (Tabela S6). Em ordem de grandeza anual, a R$ 550 e sobre o volume substituível, a adoção aditiva somaria +R$ 440 milhões; a substituição da cintilografia, −R$ 35 a +R$ 6 milhões; o filtro, +R$ 11 a −R$ 48 milhões. São cotas, não impacto orçamentário: a população elegível é fração não identificável dos denominadores (Tabela S7; Figura S1).</w:t>
+        <w:t xml:space="preserve">A direção favorece a angioTC consistentemente: o ganho de adequação da indicação é o benefício mais robusto no curto prazo (Tabela S6). Em ordem de grandeza anual, a R$ 550 e sobre o volume substituível, a adoção aditiva somaria +R$ 440 milhões; a substituição da cintilografia, −R$ 35 a +R$ 6 milhões; o filtro, +R$ 11 a −R$ 48 milhões. São cotas, não impacto orçamentário: a população elegível é fração não identificável dos denominadores (Tabela S7; Figura S1).</w:t>
       </w:r>
     </w:p>
     <w:bookmarkEnd w:id="15"/>
@@ -1631,7 +1631,7 @@
         <w:pStyle w:val="FirstParagraph"/>
       </w:pPr>
       <w:r>
-        <w:t xml:space="preserve">O CNES agora permite contar tomógrafos por canais, mas 74,6% dos estabelecimentos ainda não migraram: os 432 são piso. Dos 432, 293 são de 64 canais, faixa em que equipamentos de gerações antigas entregam dose muito maior em aquisição retrospectiva; o CNES não registra geração nem ano, mais um motivo para tratar</w:t>
+        <w:t xml:space="preserve">O CNES agora permite contar tomógrafos por canais, mas 74,6% dos estabelecimentos ainda não migraram: os 432 são piso. Dos 432, 293 são de 64 canais, faixa em que gerações antigas entregam dose muito maior em aquisição retrospectiva; o CNES não registra geração nem ano, mais um motivo para tratar</w:t>
       </w:r>
       <w:r>
         <w:t xml:space="preserve"> </w:t>
@@ -1643,7 +1643,7 @@
         <w:t xml:space="preserve"> </w:t>
       </w:r>
       <w:r>
-        <w:t xml:space="preserve">como piso. O estrato de 79 é o de maior plausibilidade de implantação sem comprar tomógrafo, mas software, sincronização, injetora e leitores habilitados não constam do cadastro. O gargalo previsível é a equipe, não o equipamento: o telelaudo supre a leitura, não a aquisição. Com doze UFs sem estabelecimento pronto, incorporar sem estratégia regional consolidaria a desigualdade.</w:t>
+        <w:t xml:space="preserve">como piso. O estrato de 79 é o de maior plausibilidade de implantação sem comprar tomógrafo, mas software, sincronização, injetora e leitores habilitados não constam do cadastro. O gargalo previsível é a equipe, não o equipamento: o telelaudo supre a leitura, não a aquisição. Os 236 estabelecimentos com ≥64 canais sem hemodinâmica são onde uma angioTC negativa evita a referência e o deslocamento do paciente; para o filtro, o estrato de 79 é conservador, não teto. Com doze UFs sem estabelecimento pronto, incorporar sem estratégia regional consolidaria a desigualdade.</w:t>
       </w:r>
     </w:p>
     <w:bookmarkEnd w:id="19"/>
@@ -1697,7 +1697,7 @@
         <w:t xml:space="preserve"> </w:t>
       </w:r>
       <w:r>
-        <w:t xml:space="preserve">No Brasil, os modelos de custo-efetividade de longo prazo de Bertoldi</w:t>
+        <w:t xml:space="preserve">No Brasil, os modelos de longo prazo de Bertoldi</w:t>
       </w:r>
       <w:r>
         <w:rPr>
@@ -1709,7 +1709,7 @@
         <w:t xml:space="preserve"> </w:t>
       </w:r>
       <w:r>
-        <w:t xml:space="preserve">respondem a uma pergunta distinta (benefício clínico ao longo do tempo), não contraditória; e o microcusteio de Carmo</w:t>
+        <w:t xml:space="preserve">respondem a outra pergunta (benefício clínico no tempo), não contraditória; o microcusteio de Carmo</w:t>
       </w:r>
       <w:r>
         <w:rPr>
@@ -1721,7 +1721,7 @@
         <w:t xml:space="preserve"> </w:t>
       </w:r>
       <w:r>
-        <w:t xml:space="preserve">precificou a angioTC (R$ 452) contra comparadores de tabela, a mesma assimetria que este estudo herda e declara.</w:t>
+        <w:t xml:space="preserve">precificou a angioTC (R$ 452) contra comparadores de tabela, assimetria que este estudo herda e declara.</w:t>
       </w:r>
     </w:p>
     <w:p>
@@ -1741,7 +1741,7 @@
         <w:t xml:space="preserve"> </w:t>
       </w:r>
       <w:r>
-        <w:t xml:space="preserve">o mais recente e mais presente no debate público, que estima economia de R$ 1.021 por beneficiário em cinco anos numa carteira de 100.000 vidas da saúde suplementar. Ele compara a angioTC (R$ 1.311,95) com a angiografia invasiva como estratégia inicial (R$ 1.900,79, único comparador), com eventos do DISCHARGE, e declara não ter comparado com testes funcionais. Ou seja, é um modelo do filtro pré-cateterismo, não da primeira linha. Nesse desenho o Δ exigido é 69 por 100, que o DISCHARGE (75,1) alcança. Transposto ao SUS, o mesmo mecanismo sustenta o filtro (R$ 482–868), não a primeira linha, que ao mesmo preço exigiria 154 cateterismos evitados por 100 pacientes. Mesma tecnologia, sinal oposto: não pelos preços relativos, mas pelo comparador. A economia, ademais, é por beneficiário de carteira, não por paciente examinado; as projeções de dezenas de bilhões veiculadas na imprensa não constam do artigo, que as qualifica como projeção teórica para a saúde suplementar.</w:t>
+        <w:t xml:space="preserve">o mais recente e mais presente no debate público, que estima economia de R$ 1.021 por beneficiário em cinco anos numa carteira de 100.000 vidas. Compara a angioTC (R$ 1.311,95) com a angiografia invasiva inicial (R$ 1.900,79, único comparador), com eventos do DISCHARGE, e declara não ter comparado com testes funcionais: é um modelo do filtro, não da primeira linha. Nesse desenho o Δ exigido é 69 por 100, que o DISCHARGE (75,1) alcança. Transposto ao SUS, o mesmo mecanismo sustenta o filtro (R$ 482–868), não a primeira linha, que ao mesmo preço exigiria 154 cateterismos evitados por 100 pacientes. Mesma tecnologia, sinal oposto: não pelos preços relativos, mas pelo comparador. A economia é por beneficiário, não por paciente examinado; as projeções de dezenas de bilhões veiculadas na imprensa não constam do artigo, que as qualifica como teóricas para a saúde suplementar.</w:t>
       </w:r>
       <w:r>
         <w:rPr>
@@ -1765,7 +1765,7 @@
         <w:pStyle w:val="FirstParagraph"/>
       </w:pPr>
       <w:r>
-        <w:t xml:space="preserve">A principal limitação é de dado: sem identificador de paciente, a análise responde a uma pergunta inversa, não a uma estimativa. A probabilidade pré-teste não está nos registros, de modo que a estratificação é premissa declarada, e os denominadores incluem assintomáticos e doença conhecida. O código de cateterismo é genérico e o CNES é autodeclarado e incompleto. Quanto ao modelo: os preços são de tabela, não custos, inclusive o do cateterismo, que credita cada Δ (se seu custo real for maior, o filtro melhora e a primeira linha não muda); a substituição é tratada como 1:1; e o horizonte curto exclui de propósito o benefício do SCOT-HEART aos 5 e 10 anos,</w:t>
+        <w:t xml:space="preserve">A principal limitação é de dado: sem identificador de paciente, a análise responde a uma pergunta inversa, não a uma estimativa. A probabilidade pré-teste não está nos registros, logo a estratificação é premissa declarada, e os denominadores incluem assintomáticos e doença conhecida. O código de cateterismo é genérico e o CNES é autodeclarado e incompleto. Quanto ao modelo: os preços são de tabela, não custos, inclusive o do cateterismo, que credita cada Δ (se seu custo real for maior, o filtro melhora e a primeira linha não muda); a substituição é tratada como 1:1; e o horizonte curto exclui de propósito o benefício do SCOT-HEART aos 5 e 10 anos,</w:t>
       </w:r>
       <w:r>
         <w:rPr>
@@ -1777,7 +1777,7 @@
         <w:t xml:space="preserve"> </w:t>
       </w:r>
       <w:r>
-        <w:t xml:space="preserve">atribuído à terapia preventiva. O débito de revascularização entra como custo sem modelar o alívio de angina que a acompanha. Contraindicações relativas (doença renal, contraste, frequência, calcificação) reduzem a população elegível; complicações, permanência, exames não diagnósticos e achados incidentais não foram quantificados. Quanto à evidência: o Δ é diferença aritmética por braço em horizontes heterogêneos, não metanálise; as contagens do CAPP vêm da metanálise de Foy; e a revascularização de Foy vem de população majoritariamente de emergência.</w:t>
+        <w:t xml:space="preserve">atribuído à prevenção. O débito de revascularização entra como custo sem modelar o alívio de angina que a acompanha. Contraindicações relativas (doença renal, contraste, frequência, calcificação) reduzem a população elegível; complicações, permanência, exames não diagnósticos, achados incidentais e o deslocamento evitado por angioTC negativa feita na origem (a favor do filtro) não foram quantificados. O preço proposto não declara o que embute em contraste, nitrato, betabloqueador e insumos de infusão, cujo custo oscila com a oferta. Quanto à evidência: o Δ é diferença aritmética por braço em horizontes heterogêneos, não metanálise; as contagens do CAPP vêm da metanálise de Foy; e a revascularização de Foy vem de população majoritariamente de emergência.</w:t>
       </w:r>
     </w:p>
     <w:p>
@@ -1831,7 +1831,7 @@
         <w:pStyle w:val="FirstParagraph"/>
       </w:pPr>
       <w:r>
-        <w:t xml:space="preserve">A pergunta talvez não seja se o SUS deve ter angioTC, mas quais pacientes a recebem primeiro e o que ela substitui. Primeiro, condicionar a incorporação a um protocolo que especifique posicionamento e substituição. Sem ele, o cenário de referência é o aditivo, em que nenhum preço plausível é neutro: a sustentabilidade é propriedade do protocolo, não do preço. O protocolo já existe na Diretriz SBC de SCC 2025, e o instrumento administrativo também: as OCI de síndrome coronariana crônica remuneram por episódio e nomeiam o exame de cada progressão. Uma progressão anatômica, em alternativa à progressão II (cintilografia, R$ 840), incorporaria a substituição no próprio código. O protocolo deve excluir explicitamente o assintomático, indicação de classe III em todas as diretrizes, porque código sem protocolo vira rastreamento.</w:t>
+        <w:t xml:space="preserve">A pergunta talvez não seja se o SUS deve ter angioTC, mas quais pacientes a recebem primeiro e o que ela substitui. Primeiro, condicionar a incorporação a um protocolo que especifique posicionamento e substituição. Sem ele, o cenário de referência é o aditivo, em que nenhum preço plausível é neutro: a sustentabilidade é propriedade do protocolo, não do preço. O protocolo já existe na Diretriz SBC de SCC 2025, e o instrumento também: as OCI de síndrome coronariana crônica remuneram por episódio e nomeiam o exame de cada progressão. Uma progressão anatômica, em alternativa à progressão II (cintilografia, R$ 840), incorporaria a substituição no próprio código. O protocolo deve excluir o assintomático, classe III em todas as diretrizes, porque código sem protocolo vira rastreamento.</w:t>
       </w:r>
     </w:p>
     <w:p>

</xml_diff>

<commit_message>
docs: conferência bibliográfica (PubMed) e diretriz AHA/ACC verbatim; carta com URL do repo; .zenodo.json
- refs: SCOT-HEART 10 anos com 'in Scotland'; Carmo PBD/Magliano CADS; Costa IBSDS/Silva MTD;
  Reis JF, Ramos RB, Marques H (autores corretos do PMID 35226221); IQWiG com
  '(with or without functional evaluation)'; release do Jornal do Brás marcado indisponível.
- Tabela S5: AHA/ACC baixa com classes verbatim (diferimento via modelo de PPT 1 B-NR;
  CAC 2a B-R; TE sem imagem 2a B-NR) — pendência '[a conferir na prova]' resolvida.
- carta-apresentacao: repositório público com URL; .zenodo.json para o DOI.

Co-Authored-By: Claude Fable 5 <noreply@anthropic.com>
</commit_message>
<xml_diff>
--- a/submissao-abc/manuscrito-cego.docx
+++ b/submissao-abc/manuscrito-cego.docx
@@ -1965,7 +1965,7 @@
         </w:numPr>
       </w:pPr>
       <w:r>
-        <w:t xml:space="preserve">Williams MC, Wereski R, Tuck C, et al. Coronary CT angiography-guided management of patients with stable chest pain: 10-year outcomes from the SCOT-HEART randomised controlled trial. Lancet. 2025;405(10475):329-37.</w:t>
+        <w:t xml:space="preserve">Williams MC, Wereski R, Tuck C, et al. Coronary CT angiography-guided management of patients with stable chest pain: 10-year outcomes from the SCOT-HEART randomised controlled trial in Scotland. Lancet. 2025;405(10475):329-37.</w:t>
       </w:r>
     </w:p>
     <w:p>
@@ -2109,7 +2109,7 @@
         </w:numPr>
       </w:pPr>
       <w:r>
-        <w:t xml:space="preserve">Carmo PB, Magliano CAS, Rey HCV, Camargo GC, Trocado LFL, Gottlieb I. Análise da custo-efetividade da angiotomografia coronariana no SUS, em comparação com outros métodos não invasivos na suspeita de DAC estável. Arq Bras Cardiol. 2022;118(3):578-85.</w:t>
+        <w:t xml:space="preserve">Carmo PBD, Magliano CADS, Rey HCV, Camargo GC, Trocado LFL, Gottlieb I. Análise da custo-efetividade da angiotomografia coronariana no SUS, em comparação com outros métodos não invasivos na suspeita de DAC estável. Arq Bras Cardiol. 2022;118(3):578-85.</w:t>
       </w:r>
     </w:p>
     <w:p>
@@ -2121,7 +2121,7 @@
         </w:numPr>
       </w:pPr>
       <w:r>
-        <w:t xml:space="preserve">Shiozaki A, Torreão J, Costa IBSS, Suarez AB, Silva MT, Oliveira TG, et al. Análise de custo-efetividade da angiotomografia coronária como exame preferencial na investigação de dor torácica estável na saúde suplementar no Brasil. Arq Bras Cardiol. 2025;122(12):e20250204.</w:t>
+        <w:t xml:space="preserve">Shiozaki A, Torreão J, Costa IBSDS, Suarez AB, Silva MTD, Oliveira TG, et al. Análise de custo-efetividade da angiotomografia coronária como exame preferencial na investigação de dor torácica estável na saúde suplementar no Brasil. Arq Bras Cardiol. 2025;122(12):e20250204.</w:t>
       </w:r>
     </w:p>
     <w:p>
@@ -2241,7 +2241,7 @@
         </w:numPr>
       </w:pPr>
       <w:r>
-        <w:t xml:space="preserve">Reis JF, Freitas P, Guerreiro S, et al. Cardiac computed tomographic angiography after abnormal ischemia test as a gatekeeper to invasive coronary angiography. Int J Cardiovasc Imaging. 2022;38(4):883-93.</w:t>
+        <w:t xml:space="preserve">Reis JF, Ramos RB, Marques H, et al. Cardiac computed tomographic angiography after abnormal ischemia test as a gatekeeper to invasive coronary angiography. Int J Cardiovasc Imaging. 2022;38(4):883-93.</w:t>
       </w:r>
     </w:p>
     <w:p>
@@ -2253,7 +2253,7 @@
         </w:numPr>
       </w:pPr>
       <w:r>
-        <w:t xml:space="preserve">Institut für Qualität und Wirtschaftlichkeit im Gesundheitswesen. Coronary computed tomography angiography for the diagnosis of chronic coronary heart disease. Final report D22-01. Colônia; 2024. NCBI Bookshelf NBK602895.</w:t>
+        <w:t xml:space="preserve">Institut für Qualität und Wirtschaftlichkeit im Gesundheitswesen. Coronary computed tomography angiography (with or without functional evaluation) for the diagnosis of chronic coronary heart disease. Final report D22-01. Colônia; 2024. NCBI Bookshelf NBK602895.</w:t>
       </w:r>
     </w:p>
     <w:p>
@@ -2277,7 +2277,7 @@
         </w:numPr>
       </w:pPr>
       <w:r>
-        <w:t xml:space="preserve">Duarte M. Doenças cardiovasculares causam mais de 300 mil mortes por ano no Brasil; Conitec abre consulta pública sobre angiotomografia coronariana no SUS [release de imprensa]. Jornal do Brás. 11 ago 2026. Acesso em 16 ago 2026.</w:t>
+        <w:t xml:space="preserve">Duarte M. Doenças cardiovasculares causam mais de 300 mil mortes por ano no Brasil; Conitec abre consulta pública sobre angiotomografia coronariana no SUS [release de imprensa]. Jornal do Brás. 11 ago 2026. Acesso em 16 ago 2026 (indisponível em 24 ago 2026).</w:t>
       </w:r>
     </w:p>
     <w:p>

</xml_diff>

<commit_message>
docs: volta o manuscrito a 5.000 palavras após as citações completas
</commit_message>
<xml_diff>
--- a/submissao-abc/manuscrito-cego.docx
+++ b/submissao-abc/manuscrito-cego.docx
@@ -1913,7 +1913,7 @@
         <w:t xml:space="preserve"> </w:t>
       </w:r>
       <w:r>
-        <w:t xml:space="preserve">Capacidade tomográfica compatível com angioTC por UF (CNES 06/2026): equipamentos ≥64 canais por milhão, estrato pronto, UFs sem ≥64 canais e parque total.</w:t>
+        <w:t xml:space="preserve">Capacidade compatível com angioTC por UF (CNES 06/2026): ≥64 canais por milhão, estrato pronto, UFs sem ≥64 e parque total.</w:t>
       </w:r>
     </w:p>
     <w:p>
@@ -2193,7 +2193,7 @@
         </w:numPr>
       </w:pPr>
       <w:r>
-        <w:t xml:space="preserve">Douglas PS, Nanna MG, Kelsey MD, et al. Comparison of an initial risk-based testing strategy vs usual testing in stable symptomatic patients with suspected coronary artery disease (PRECISE). JAMA Cardiol. 2023;8(10):904-14; desfechos econômicos: Chew DS, et al. Circ Cardiovasc Qual Outcomes. 2025;18(2):e011008.</w:t>
+        <w:t xml:space="preserve">Douglas PS, Nanna MG, Kelsey MD, et al. Comparison of an initial risk-based testing strategy vs usual testing in stable symptomatic patients with suspected coronary artery disease (PRECISE). JAMA Cardiol. 2023;8(10):904-14; econômico: Chew DS, et al. Circ Cardiovasc Qual Outcomes. 2025;18(2):e011008.</w:t>
       </w:r>
     </w:p>
     <w:p>
@@ -2277,7 +2277,7 @@
         </w:numPr>
       </w:pPr>
       <w:r>
-        <w:t xml:space="preserve">Duarte M. Doenças cardiovasculares causam mais de 300 mil mortes por ano no Brasil; Conitec abre consulta pública sobre angiotomografia coronariana no SUS [release de imprensa]. Jornal do Brás. 11 ago 2026. Acesso em 16 ago 2026 (indisponível em 24 ago 2026).</w:t>
+        <w:t xml:space="preserve">Duarte M. Doenças cardiovasculares causam mais de 300 mil mortes por ano no Brasil; Conitec abre consulta pública sobre angiotomografia coronariana no SUS [release de imprensa]. Jornal do Brás. 11 ago 2026. Acesso em 16 ago 2026; indisponível em 24 ago 2026.</w:t>
       </w:r>
     </w:p>
     <w:p>

</xml_diff>

<commit_message>
docs: encurta refs 1 e 10 para fechar em 5.000 palavras
</commit_message>
<xml_diff>
--- a/submissao-abc/manuscrito-cego.docx
+++ b/submissao-abc/manuscrito-cego.docx
@@ -1953,7 +1953,7 @@
         </w:numPr>
       </w:pPr>
       <w:r>
-        <w:t xml:space="preserve">SCOT-HEART Investigators. CT coronary angiography in patients with suspected angina due to coronary heart disease (SCOT-HEART). Lancet. 2015;385(9985):2383-91; Williams MC, et al. J Am Coll Cardiol. 2016;67(15):1759-68; Newby DE, et al. N Engl J Med. 2018;379(10):924-33.</w:t>
+        <w:t xml:space="preserve">SCOT-HEART Investigators. CT coronary angiography in patients with suspected angina due to coronary heart disease. Lancet. 2015;385(9985):2383-91; Williams MC, et al. J Am Coll Cardiol. 2016;67(15):1759-68; Newby DE, et al. N Engl J Med. 2018;379(10):924-33.</w:t>
       </w:r>
     </w:p>
     <w:p>
@@ -2061,7 +2061,7 @@
         </w:numPr>
       </w:pPr>
       <w:r>
-        <w:t xml:space="preserve">Brasil. Ministério da Saúde. Conitec. Relatório para a Sociedade nº 745: angiotomografia coronariana como exame de primeira linha em pacientes sintomáticos e probabilidade pré-teste baixa ou intermediária com suspeita de doença arterial coronariana estável. Brasília; ago 2026.</w:t>
+        <w:t xml:space="preserve">Brasil. Ministério da Saúde. Conitec. Relatório para a Sociedade nº 745: angiotomografia coronariana como exame de primeira linha. Brasília; ago 2026.</w:t>
       </w:r>
     </w:p>
     <w:p>

</xml_diff>